<commit_message>
Add vector search (semantic retrieval) to data layer architecture on system architecture document
</commit_message>
<xml_diff>
--- a/documents/Project_Kizuna_Sistem_Tasarimi.docx
+++ b/documents/Project_Kizuna_Sistem_Tasarimi.docx
@@ -844,13 +844,7 @@
         <w:spacing w:before="80" w:after="80"/>
       </w:pPr>
       <w:r>
-        <w:rPr>
-          <w:rFonts w:ascii="Arial" w:hAnsi="Arial" w:cs="Arial"/>
-          <w:sz w:val="22"/>
-          <w:sz-cs w:val="22"/>
-          <w:color w:val="333333"/>
-        </w:rPr>
-        <w:t xml:space="preserve">Sistem dort ana katmandan olusur: Sunum Katmani (Flutter UI), Is Mantigi Katmani (Dart), AI Motoru Katmani (llama.cpp / Sunucu), ve Veri Katmani (SQLite + Dosya Sistemi).</w:t>
+        <w:t>Sistem dort ana katmandan olusur: Sunum Katmani (Flutter UI), Is Mantigi Katmani (Dart), AI Motoru Katmani (llama.cpp / Sunucu), ve Veri Katmani (SQLite + Vektor Aramasi + Dosya Sistemi).</w:t>
       </w:r>
     </w:p>
     <w:p>
@@ -954,13 +948,7 @@
     <w:p>
       <w:pPr/>
       <w:r>
-        <w:rPr>
-          <w:rFonts w:ascii="Arial" w:hAnsi="Arial" w:cs="Arial"/>
-          <w:sz w:val="20"/>
-          <w:sz-cs w:val="20"/>
-          <w:color w:val="333333"/>
-        </w:rPr>
-        <w:t xml:space="preserve">[ VERI KATMANI ]   SQLite (konusmalar, hafiza)  |  JSON (karakter profilleri)</w:t>
+        <w:t>[ VERI KATMANI ]   SQLite (konusmalar, hafiza)  |  Vektor DB (semantic retrieval)  |  JSON (karakter profilleri)</w:t>
       </w:r>
     </w:p>
     <w:p>
@@ -1112,18 +1100,17 @@
       </w:r>
     </w:p>
     <w:p>
-      <w:pPr>
-        <w:ind w:left="360"/>
-        <w:spacing w:before="80" w:after="80"/>
-      </w:pPr>
-      <w:r>
-        <w:rPr>
-          <w:rFonts w:ascii="Courier New" w:hAnsi="Courier New" w:cs="Courier New"/>
-          <w:sz w:val="18"/>
-          <w:sz-cs w:val="18"/>
-          <w:color w:val="1A3A5C"/>
-        </w:rPr>
-        <w:t xml:space="preserve">      memory_manager.dart     # Ozetleme + semantic retrieval</w:t>
+      <w:r>
+        <w:t xml:space="preserve">      vector_store.dart       # Embedding depolama + benzerlik aramasi (sqlite-vec / ObjectBox)</w:t>
+      </w:r>
+    </w:p>
+    <w:p>
+      <w:pPr>
+        <w:ind w:left="360"/>
+        <w:spacing w:before="80" w:after="80"/>
+      </w:pPr>
+      <w:r>
+        <w:t xml:space="preserve">      memory_manager.dart     # Ozetleme + vektor tabanli semantic retrieval</w:t>
       </w:r>
     </w:p>
     <w:p>
@@ -6198,6 +6185,90 @@
         <w:t xml:space="preserve"/>
       </w:r>
     </w:p>
+    <w:p/>
+    <w:p>
+      <w:r>
+        <w:t>);</w:t>
+      </w:r>
+    </w:p>
+    <w:p>
+      <w:r>
+        <w:t xml:space="preserve">  created_at INTEGER</w:t>
+      </w:r>
+    </w:p>
+    <w:p>
+      <w:r>
+        <w:t xml:space="preserve">  embedding BLOB NOT NULL,         -- vektor (float32 listesi)</w:t>
+      </w:r>
+    </w:p>
+    <w:p>
+      <w:r>
+        <w:t xml:space="preserve">  content_text TEXT NOT NULL,      -- orijinal metin</w:t>
+      </w:r>
+    </w:p>
+    <w:p>
+      <w:r>
+        <w:t xml:space="preserve">  source_id INTEGER NOT NULL,      -- ilgili kaydin id'si</w:t>
+      </w:r>
+    </w:p>
+    <w:p>
+      <w:r>
+        <w:t xml:space="preserve">  source_type TEXT NOT NULL,       -- 'conversation' / 'observation' / 'summary'</w:t>
+      </w:r>
+    </w:p>
+    <w:p>
+      <w:r>
+        <w:t xml:space="preserve">  character_id TEXT NOT NULL,</w:t>
+      </w:r>
+    </w:p>
+    <w:p>
+      <w:r>
+        <w:t xml:space="preserve">  id INTEGER PRIMARY KEY AUTOINCREMENT,</w:t>
+      </w:r>
+    </w:p>
+    <w:p>
+      <w:r>
+        <w:t>CREATE TABLE memory_embeddings (</w:t>
+      </w:r>
+    </w:p>
+    <w:p>
+      <w:r>
+        <w:t>-- memory_embeddings tablosu (sqlite-vec veya BLOB ile)</w:t>
+      </w:r>
+    </w:p>
+    <w:p/>
+    <w:p>
+      <w:r>
+        <w:t>• Gecici cozum: Embedding'leri SQLite BLOB olarak sakla, Dart'ta cosine similarity (kucuk veri seti icin &lt;5000 kayit yeterli).</w:t>
+      </w:r>
+    </w:p>
+    <w:p>
+      <w:r>
+        <w:t>• ObjectBox: Flutter icin yerel vektor aramasi destegi. Ek bagimlilik.</w:t>
+      </w:r>
+    </w:p>
+    <w:p>
+      <w:r>
+        <w:t>• sqlite-vec: SQLite eklentisi, vektor benzerlik aramasi. Flutter/sqflite ile extension yukleme platforma bagli.</w:t>
+      </w:r>
+    </w:p>
+    <w:p>
+      <w:r>
+        <w:t>Secenekler:</w:t>
+      </w:r>
+    </w:p>
+    <w:p/>
+    <w:p>
+      <w:r>
+        <w:t>6.2.1 Vektor Aramasi (Semantic Retrieval)</w:t>
+      </w:r>
+    </w:p>
+    <w:p>
+      <w:r>
+        <w:t>SQLite FTS (Full Text Search) sadece kelime eslestirmesi yapar; anlam benzerligi (semantic) aramasi yapamaz. RAG mekanizmasi icin hafiza birimlerinin embedding'lerini tutmak ve benzerlik aramasi yapmak zorunludur.</w:t>
+      </w:r>
+    </w:p>
+    <w:p/>
     <w:p>
       <w:pPr>
         <w:spacing w:before="320" w:after="160"/>
@@ -13903,6 +13974,21 @@
           <w:color w:val="333333"/>
         </w:rPr>
         <w:t xml:space="preserve">Sifrelenmis yerel depolama</w:t>
+      </w:r>
+    </w:p>
+    <w:p>
+      <w:r>
+        <w:t>Semantic retrieval, RAG icin embedding depolama</w:t>
+      </w:r>
+    </w:p>
+    <w:p>
+      <w:r>
+        <w:t>sqlite-vec / ObjectBox</w:t>
+      </w:r>
+    </w:p>
+    <w:p>
+      <w:r>
+        <w:t>Vektor Aramasi</w:t>
       </w:r>
     </w:p>
     <w:p>

</xml_diff>